<commit_message>
Fix glass-on-my-pillow: remove duplicate title/subtitle from article body
Subagent wrote title and subtitle as plain text in the body after the
YAML frontmatter; removed them so they appear only in the publisher
checklist, not repeated at the top of the article.

Co-Authored-By: Claude Sonnet 4.6 <noreply@anthropic.com>
Claude-Session: https://claude.ai/code/session_015RE4AKHUoaX39pobuT8oag
</commit_message>
<xml_diff>
--- a/content/substack/glass-on-my-pillow.docx
+++ b/content/substack/glass-on-my-pillow.docx
@@ -170,34 +170,6 @@
       <w:pPr>
         <w:spacing w:after="80"/>
       </w:pPr>
-    </w:p>
-    <w:p>
-      <w:pPr>
-        <w:spacing w:after="160" w:before="0"/>
-      </w:pPr>
-      <w:r>
-        <w:rPr>
-          <w:rFonts w:ascii="Calibri" w:hAnsi="Calibri"/>
-          <w:b w:val="0"/>
-          <w:i w:val="0"/>
-          <w:sz w:val="22"/>
-        </w:rPr>
-        <w:t>I Fixed My Own Broken Window While the BOP Jackhammered Sidewalks That Were Perfectly Fine</w:t>
-      </w:r>
-    </w:p>
-    <w:p>
-      <w:pPr>
-        <w:spacing w:after="160" w:before="0"/>
-      </w:pPr>
-      <w:r>
-        <w:rPr>
-          <w:rFonts w:ascii="Calibri" w:hAnsi="Calibri"/>
-          <w:b w:val="0"/>
-          <w:i w:val="0"/>
-          <w:sz w:val="22"/>
-        </w:rPr>
-        <w:t>Fort Dix houses 4,100 people. The Bureau cannot close it.</w:t>
-      </w:r>
     </w:p>
     <w:p>
       <w:pPr>

</xml_diff>

<commit_message>
Rewrite Fort Dix dispatch: AIG frame, corrected timeline, full window story
- New opening: AIG/too big to fail analytical frame
- Window: winter nor'easter, officers filed work order, no inventory,
  two days of packing tape, sourced window himself, inmate built fix
- Sidewalk: separate summer events (a few weeks ago + last week extension)
  not tied to window timeline
- One Big Beautiful Bill: $5B total ($3B staffing, $2B infrastructure)
  vs $4B backlog; Director Marshall's stated priorities vs. observed spend
- Fort Dix as beautiful property; Hindenburg/Garden State detail
- Close: AIG echo, funding expires 2029

Co-Authored-By: Claude Sonnet 4.6 <noreply@anthropic.com>
Claude-Session: https://claude.ai/code/session_015RE4AKHUoaX39pobuT8oag
</commit_message>
<xml_diff>
--- a/content/substack/glass-on-my-pillow.docx
+++ b/content/substack/glass-on-my-pillow.docx
@@ -218,7 +218,7 @@
           <w:i w:val="0"/>
           <w:sz w:val="22"/>
         </w:rPr>
-        <w:t>I was asleep when the window went.</w:t>
+        <w:t>What happens when something is too big to fail?</w:t>
       </w:r>
     </w:p>
     <w:p>
@@ -232,7 +232,21 @@
           <w:i w:val="0"/>
           <w:sz w:val="22"/>
         </w:rPr>
-        <w:t>A wind gust pushed the slide window in, and I woke up to glass — on my bed, on my pillow, on the floor beside me. I reported it to staff informally, not through any grievance process, because if I used an official channel, someone would try to claim I'd broken it myself.</w:t>
+        <w:t>In 2008, the federal government answered that question with AIG. The insurance giant had written so many financial guarantees across so much of the global system that letting it fail would have pulled everything else down with it. The government stepped in with over $180 billion. The people who made the decisions that brought AIG to that point were not the ones who paid the price. The systemic problems that made a bailout necessary did not disappear. The institution was rescued. The dysfunction continued.</w:t>
+      </w:r>
+    </w:p>
+    <w:p>
+      <w:pPr>
+        <w:spacing w:after="160" w:before="0"/>
+      </w:pPr>
+      <w:r>
+        <w:rPr>
+          <w:rFonts w:ascii="Calibri" w:hAnsi="Calibri"/>
+          <w:b w:val="0"/>
+          <w:i w:val="0"/>
+          <w:sz w:val="22"/>
+        </w:rPr>
+        <w:t>Fort Dix is the AIG of the federal prison system.</w:t>
       </w:r>
     </w:p>
     <w:p>
@@ -254,7 +268,7 @@
           <w:i w:val="0"/>
           <w:sz w:val="22"/>
         </w:rPr>
-        <w:t>So I waited.</w:t>
+        <w:t>More than 4,100 people are housed here. Fort Dix is the largest federal prison in the United States, split across two compounds — East and West — each holding roughly 2,000 inmates. There is nowhere to put 4,100 people. The Bureau of Prisons cannot close this facility. The math does not exist.</w:t>
       </w:r>
     </w:p>
     <w:p>
@@ -268,21 +282,7 @@
           <w:i w:val="0"/>
           <w:sz w:val="22"/>
         </w:rPr>
-        <w:t>Several days passed while an inmate sourced wood and tools and built the fix: a six-inch board of plywood, bolted to the top of the sill, to stop the window from flying out again. I found the replacement window myself — old, rigged, one full pane missing, but the glass it still has stays in place.</w:t>
-      </w:r>
-    </w:p>
-    <w:p>
-      <w:pPr>
-        <w:spacing w:after="160" w:before="0"/>
-      </w:pPr>
-      <w:r>
-        <w:rPr>
-          <w:rFonts w:ascii="Calibri" w:hAnsi="Calibri"/>
-          <w:b w:val="0"/>
-          <w:i w:val="0"/>
-          <w:sz w:val="22"/>
-        </w:rPr>
-        <w:t>The BOP did not fix the window. An inmate did.</w:t>
+        <w:t>Too big to fail means the institution persists regardless of how it performs, because the people making decisions about it don't live inside it.</w:t>
       </w:r>
     </w:p>
     <w:p>
@@ -304,7 +304,7 @@
           <w:i w:val="0"/>
           <w:sz w:val="22"/>
         </w:rPr>
-        <w:t>That same week, I watched a crew jackhammer the entire sidewalk run outside.</w:t>
+        <w:t>I should say plainly: Fort Dix is a beautiful property. It sits in New Jersey's Garden State — part of the same joint military base as the field where the Hindenburg came down in 1937. Squirrels, birds, possums, and cats live in the condemned building I walk past every time I go anywhere on this compound. People feed them. That part genuinely isn't all doom and gloom.</w:t>
       </w:r>
     </w:p>
     <w:p>
@@ -318,21 +318,7 @@
           <w:i w:val="0"/>
           <w:sz w:val="22"/>
         </w:rPr>
-        <w:t>Not the sections that were cracked through. All of it. The sidewalks at Fort Dix are in large part perfectly fine — surface cracks here and there, the kind you patch with compound and move on. Instead, crews came through and pulled the whole thing up, poured entirely new concrete, then came back the next day and extended the project another thirty feet.</w:t>
-      </w:r>
-    </w:p>
-    <w:p>
-      <w:pPr>
-        <w:spacing w:after="160" w:before="0"/>
-      </w:pPr>
-      <w:r>
-        <w:rPr>
-          <w:rFonts w:ascii="Calibri" w:hAnsi="Calibri"/>
-          <w:b w:val="0"/>
-          <w:i w:val="0"/>
-          <w:sz w:val="22"/>
-        </w:rPr>
-        <w:t>I watched this from inside a building held together partly by packing tape.</w:t>
+        <w:t>The condemned building does have a hard hat required sign — required if you step off the sidewalk. Bricks fall off it. But the wildlife settled in long ago and they seem comfortable.</w:t>
       </w:r>
     </w:p>
     <w:p>
@@ -354,7 +340,7 @@
           <w:i w:val="0"/>
           <w:sz w:val="22"/>
         </w:rPr>
-        <w:t>Every day I walk to chow, to rec, to health services, to education — every trip on this compound — I pass within six feet of a condemned building. There is a hard hat required sign posted between the sidewalk and the building. Bricks fall off it.</w:t>
+        <w:t>Several months ago, during a nor'easter, a wind gust pushed my window in while I was sleeping.</w:t>
       </w:r>
     </w:p>
     <w:p>
@@ -368,7 +354,7 @@
           <w:i w:val="0"/>
           <w:sz w:val="22"/>
         </w:rPr>
-        <w:t>Inmates call it Jumanji — wildlife moved in years ago: cats, possums, skunks, groundhogs, squirrels. People feed them; the cats wander the compound, and that part honestly isn't all bad. But the building is condemned, and there it stands.</w:t>
+        <w:t>I reported it to staff — not through any formal grievance, so no one could claim I broke it myself. The officers filed a work order. The inmate who handles that kind of maintenance came by and explained the situation: there are no replacement windows in inventory. He would figure something out, but sourcing materials would take a few days.</w:t>
       </w:r>
     </w:p>
     <w:p>
@@ -382,7 +368,49 @@
           <w:i w:val="0"/>
           <w:sz w:val="22"/>
         </w:rPr>
-        <w:t>At some point, bleachers were installed against one of Jumanji's walls. An associate warden — later promoted — confirmed to me directly: "They should never have put them there." She meant the bleachers. She was right, she got promoted, and the bleachers are still there.</w:t>
+        <w:t>So I taped the window shut with packing tape. For two days, during a New Jersey nor'easter, I slept in a room sealed with tape.</w:t>
+      </w:r>
+    </w:p>
+    <w:p>
+      <w:pPr>
+        <w:spacing w:after="160" w:before="0"/>
+      </w:pPr>
+      <w:r>
+        <w:rPr>
+          <w:rFonts w:ascii="Calibri" w:hAnsi="Calibri"/>
+          <w:b w:val="0"/>
+          <w:i w:val="0"/>
+          <w:sz w:val="22"/>
+        </w:rPr>
+        <w:t>After two days I found a window I could prop in — old, missing an entire pane, but better than nothing. It at least let the heat work. The maintenance inmate built the fix: a six-inch board of plywood bolted to the top of the sill, stopping the frame from flying out again.</w:t>
+      </w:r>
+    </w:p>
+    <w:p>
+      <w:pPr>
+        <w:spacing w:after="160" w:before="0"/>
+      </w:pPr>
+      <w:r>
+        <w:rPr>
+          <w:rFonts w:ascii="Calibri" w:hAnsi="Calibri"/>
+          <w:b w:val="0"/>
+          <w:i w:val="0"/>
+          <w:sz w:val="22"/>
+        </w:rPr>
+        <w:t>The fix works. The officers who filed the work order did their jobs. The inmate who sourced the materials and made the repair did his. The BOP has been increasing inmate pay for facility maintenance and reducing reliance on outside contractors — those are good decisions, and the people on the ground make this place function.</w:t>
+      </w:r>
+    </w:p>
+    <w:p>
+      <w:pPr>
+        <w:spacing w:after="160" w:before="0"/>
+      </w:pPr>
+      <w:r>
+        <w:rPr>
+          <w:rFonts w:ascii="Calibri" w:hAnsi="Calibri"/>
+          <w:b w:val="0"/>
+          <w:i w:val="0"/>
+          <w:sz w:val="22"/>
+        </w:rPr>
+        <w:t>The problem is that there were no replacement windows in inventory.</w:t>
       </w:r>
     </w:p>
     <w:p>
@@ -404,7 +432,7 @@
           <w:i w:val="0"/>
           <w:sz w:val="22"/>
         </w:rPr>
-        <w:t>About one-third of the main hallway — the corridor every inmate uses to get anywhere on this compound — has a drop ceiling that sags so low that anyone over six-foot-one has to duck to clear it. Every day. Both directions.</w:t>
+        <w:t>A few weeks ago, a crew showed up outside with jackhammers.</w:t>
       </w:r>
     </w:p>
     <w:p>
@@ -418,7 +446,35 @@
           <w:i w:val="0"/>
           <w:sz w:val="22"/>
         </w:rPr>
-        <w:t>Walk through enough times, you stop seeing it. That is the thing about institutional decay. You adapt, and the adapting makes the problem invisible, and the invisibility becomes the justification for not fixing it.</w:t>
+        <w:t>The sidewalks at Fort Dix are in large part perfectly fine — surface cracks here and there, the kind you address with patch compound. Instead, the entire run was torn up and replaced with new concrete, four inches deep. Last week the crew came back and extended the project another thirty feet.</w:t>
+      </w:r>
+    </w:p>
+    <w:p>
+      <w:pPr>
+        <w:spacing w:after="160" w:before="0"/>
+      </w:pPr>
+      <w:r>
+        <w:rPr>
+          <w:rFonts w:ascii="Calibri" w:hAnsi="Calibri"/>
+          <w:b w:val="0"/>
+          <w:i w:val="0"/>
+          <w:sz w:val="22"/>
+        </w:rPr>
+        <w:t>Ninety feet of new concrete. Director Marshall has said the $2 billion in infrastructure funding would go toward repairs that "prioritize life safety, security, and operational" needs.</w:t>
+      </w:r>
+    </w:p>
+    <w:p>
+      <w:pPr>
+        <w:spacing w:after="160" w:before="0"/>
+      </w:pPr>
+      <w:r>
+        <w:rPr>
+          <w:rFonts w:ascii="Calibri" w:hAnsi="Calibri"/>
+          <w:b w:val="0"/>
+          <w:i w:val="0"/>
+          <w:sz w:val="22"/>
+        </w:rPr>
+        <w:t>Not one goddamn foot of that sidewalk needed replacing.</w:t>
       </w:r>
     </w:p>
     <w:p>
@@ -440,7 +496,7 @@
           <w:i w:val="0"/>
           <w:sz w:val="22"/>
         </w:rPr>
-        <w:t>The chow hall air conditioning has not worked correctly in eleven years.</w:t>
+        <w:t>I pass the condemned building — we call it Jumanji — every time I walk anywhere on this compound. Six feet from the sidewalk. Bleachers were installed against one of its walls at some point. An associate warden confirmed to me directly: "They should never have put them there." She meant the bleachers. She was later promoted. The bleachers are still there.</w:t>
       </w:r>
     </w:p>
     <w:p>
@@ -454,7 +510,7 @@
           <w:i w:val="0"/>
           <w:sz w:val="22"/>
         </w:rPr>
-        <w:t>Every summer. Every heat wave. Without exception. An inmate who does HVAC work told me the original system was undersized for the building — the wrong unit for the square footage, from the day it was installed. That is his assessment, not a verified engineering report. But I have watched it fail every summer for years, so the diagnosis feels right whether or not the technical cause is exactly what he described.</w:t>
+        <w:t>About one-third of the main hallway — the corridor every inmate uses to get anywhere — has a drop ceiling that sags so low that anyone over six-foot-one has to duck to clear it. Every day. Both directions.</w:t>
       </w:r>
     </w:p>
     <w:p>
@@ -468,21 +524,7 @@
           <w:i w:val="0"/>
           <w:sz w:val="22"/>
         </w:rPr>
-        <w:t>During a recent heat wave, I watched an officer I have known for years try to reset the unit four times. He looked at it and said: "This sucks. I have tried to reset it four times and it won't work."</w:t>
-      </w:r>
-    </w:p>
-    <w:p>
-      <w:pPr>
-        <w:spacing w:after="160" w:before="0"/>
-      </w:pPr>
-      <w:r>
-        <w:rPr>
-          <w:rFonts w:ascii="Calibri" w:hAnsi="Calibri"/>
-          <w:b w:val="0"/>
-          <w:i w:val="0"/>
-          <w:sz w:val="22"/>
-        </w:rPr>
-        <w:t>He was right. It didn't work. It never works.</w:t>
+        <w:t>The chow hall air conditioning has not worked correctly in eleven years. An inmate who does HVAC work told me the original system was undersized for the building — the wrong unit for the square footage from the day it was installed. That is his assessment, not a verified engineering report. During a recent heat wave an officer I have known for years tried to reset the unit four times and said: "This sucks. I have tried to reset it four times and it won't work." He works there. The BOP is failing its own employees in the same building where it fails us.</w:t>
       </w:r>
     </w:p>
     <w:p>
@@ -504,7 +546,7 @@
           <w:i w:val="0"/>
           <w:sz w:val="22"/>
         </w:rPr>
-        <w:t>On July 1, 2026, Director William K. Marshall III announced the closure of six federal prisons. The stated reasons: extreme staffing challenges and a deferred maintenance backlog exceeding $4 billion. His statement: "We are a Bureau that acts."</w:t>
+        <w:t>The maintenance staff here are not the problem. They are the little Dutch boy with the dam — holding things together with what they have, on a budget that does not match the scale of what needs holding. The failure lives higher up, in the choices about what gets a jackhammer crew and what gets a work order that waits months for an inmate to source materials.</w:t>
       </w:r>
     </w:p>
     <w:p>
@@ -518,49 +560,7 @@
           <w:i w:val="0"/>
           <w:sz w:val="22"/>
         </w:rPr>
-        <w:t>One of the six was FCI Big Spring, in Texas.</w:t>
-      </w:r>
-    </w:p>
-    <w:p>
-      <w:pPr>
-        <w:spacing w:after="160" w:before="0"/>
-      </w:pPr>
-      <w:r>
-        <w:rPr>
-          <w:rFonts w:ascii="Calibri" w:hAnsi="Calibri"/>
-          <w:b w:val="0"/>
-          <w:i w:val="0"/>
-          <w:sz w:val="22"/>
-        </w:rPr>
-        <w:t>After I sued the BOP, the government transferred me to Big Spring. I litigated that transfer with attorneys from Cole Schotz on a pro bono basis, and the government transferred me back.</w:t>
-      </w:r>
-    </w:p>
-    <w:p>
-      <w:pPr>
-        <w:spacing w:after="160" w:before="0"/>
-      </w:pPr>
-      <w:r>
-        <w:rPr>
-          <w:rFonts w:ascii="Calibri" w:hAnsi="Calibri"/>
-          <w:b w:val="0"/>
-          <w:i w:val="0"/>
-          <w:sz w:val="22"/>
-        </w:rPr>
-        <w:t>Before I arrived at Big Spring, half the housing units were already shuttered. While I was there, I came to understand something I hadn't fully grasped from inside Fort Dix: Fort Dix is not a bad facility. Big Spring was in far worse condition, and Big Spring got closed for it.</w:t>
-      </w:r>
-    </w:p>
-    <w:p>
-      <w:pPr>
-        <w:spacing w:after="160" w:before="0"/>
-      </w:pPr>
-      <w:r>
-        <w:rPr>
-          <w:rFonts w:ascii="Calibri" w:hAnsi="Calibri"/>
-          <w:b w:val="0"/>
-          <w:i w:val="0"/>
-          <w:sz w:val="22"/>
-        </w:rPr>
-        <w:t>Fort Dix will not be closed.</w:t>
+        <w:t>The BOP operates without local code requirements, without permit approvals, without outside authorizations. Their statutory obligation is to provide housing that is suitable and safe. That is a low bar. They can move fast with money when they choose to.</w:t>
       </w:r>
     </w:p>
     <w:p>
@@ -582,7 +582,7 @@
           <w:i w:val="0"/>
           <w:sz w:val="22"/>
         </w:rPr>
-        <w:t>Fort Dix houses more than 4,100 people — the largest federal prison in the United States, split across two compounds, East and West, each holding roughly 2,000 inmates. There is nowhere to put 4,100 people. The Bureau cannot move them. The math does not exist.</w:t>
+        <w:t>In 2025, the One Big Beautiful Bill gave the Bureau of Prisons $5 billion — $3 billion for staffing and training, $2 billion specifically earmarked for infrastructure and maintenance. The deferred maintenance backlog the Bureau is carrying exceeds $4 billion. The $2 billion does not close that gap.</w:t>
       </w:r>
     </w:p>
     <w:p>
@@ -596,7 +596,7 @@
           <w:i w:val="0"/>
           <w:sz w:val="22"/>
         </w:rPr>
-        <w:t>Fort Dix is the AIG of the federal prison system. Too big to fail doesn't mean the problem gets fixed — it means the problem gets managed. You plug the gaps you absolutely have to plug, defer the rest until something forces your hand, and rely on the fact that no one — no budget committee, no oversight board, no administration — can absorb the disruption of shutting the place down.</w:t>
+        <w:t>On July 1, 2026, Director William K. Marshall III announced the closure of six federal prisons, citing that $4 billion backlog. FCI Big Spring was on the list. After I sued the BOP, they transferred me there. I litigated my way back with Cole Schotz attorneys on a pro bono basis. Before I arrived at Big Spring, half the housing units were already shuttered. Being there is what made me fully understand that Fort Dix, for all of this, is not a bad facility. Big Spring was far worse — and Big Spring got closed for it.</w:t>
       </w:r>
     </w:p>
     <w:p>
@@ -610,7 +610,21 @@
           <w:i w:val="0"/>
           <w:sz w:val="22"/>
         </w:rPr>
-        <w:t>So the sidewalks get replaced. And the window gets packing tape.</w:t>
+        <w:t>"We are a Bureau that acts," Director Marshall said.</w:t>
+      </w:r>
+    </w:p>
+    <w:p>
+      <w:pPr>
+        <w:spacing w:after="160" w:before="0"/>
+      </w:pPr>
+      <w:r>
+        <w:rPr>
+          <w:rFonts w:ascii="Calibri" w:hAnsi="Calibri"/>
+          <w:b w:val="0"/>
+          <w:i w:val="0"/>
+          <w:sz w:val="22"/>
+        </w:rPr>
+        <w:t>Fort Dix will not be closed. There is no place to put 4,100 people.</w:t>
       </w:r>
     </w:p>
     <w:p>
@@ -632,7 +646,7 @@
           <w:i w:val="0"/>
           <w:sz w:val="22"/>
         </w:rPr>
-        <w:t>The maintenance staff here are not the problem. They are the little Dutch boy with the dam — plugging gaps with what they have, on a budget that doesn't match what they're being asked to hold together. The failure is not theirs. It is the pattern of institutional choices: what gets a crew with a jackhammer, and what gets a six-inch board of plywood.</w:t>
+        <w:t>The One Big Beautiful Bill funding expires September 30, 2029.</w:t>
       </w:r>
     </w:p>
     <w:p>
@@ -646,29 +660,7 @@
           <w:i w:val="0"/>
           <w:sz w:val="22"/>
         </w:rPr>
-        <w:t>Those choices are not random. They are just not made with the people who live here in mind.</w:t>
-      </w:r>
-    </w:p>
-    <w:p>
-      <w:pPr>
-        <w:spacing w:before="120" w:after="120"/>
-        <w:pBdr>
-          <w:bottom w:val="single" w:sz="4" w:space="1" w:color="CCCCCC"/>
-        </w:pBdr>
-      </w:pPr>
-    </w:p>
-    <w:p>
-      <w:pPr>
-        <w:spacing w:after="160" w:before="0"/>
-      </w:pPr>
-      <w:r>
-        <w:rPr>
-          <w:rFonts w:ascii="Calibri" w:hAnsi="Calibri"/>
-          <w:b w:val="0"/>
-          <w:i w:val="0"/>
-          <w:sz w:val="22"/>
-        </w:rPr>
-        <w:t>There is still glass I haven't found yet — every few days a new piece surfaces, a sliver near the bed, a shard I missed the first sweep. The window is fixed now, after a fashion. The board holds.</w:t>
+        <w:t>AIG survived its bailout. The conditions that made a bailout necessary survived with it. When the $5 billion runs out, the question for Fort Dix will be the same question it has always been: what gets fixed when the people making the decisions don't live with what isn't?</w:t>
       </w:r>
     </w:p>
     <w:p>
@@ -682,7 +674,7 @@
           <w:i w:val="0"/>
           <w:sz w:val="22"/>
         </w:rPr>
-        <w:t>I still check my bed before I get in.</w:t>
+        <w:t>The board on my window will still be there. So will Jumanji.</w:t>
       </w:r>
     </w:p>
     <w:p>
@@ -704,7 +696,7 @@
           <w:i/>
           <w:sz w:val="22"/>
         </w:rPr>
-        <w:t>If you have been inside, or have someone inside right now: what do you walk past every day that no one is ever going to fix?</w:t>
+        <w:t>The Bureau received $5 billion to address federal infrastructure. If your family member is inside right now — at Fort Dix or anywhere else — what have they described getting fixed in the last year, and what has been left alone? Leave it in the comments.</w:t>
       </w:r>
     </w:p>
     <w:p>
@@ -776,21 +768,7 @@
           <w:i w:val="0"/>
           <w:sz w:val="22"/>
         </w:rPr>
-        <w:t>He is a United States Marine Corps veteran and the author of* Surviving</w:t>
-      </w:r>
-    </w:p>
-    <w:p>
-      <w:pPr>
-        <w:spacing w:after="160" w:before="0"/>
-      </w:pPr>
-      <w:r>
-        <w:rPr>
-          <w:rFonts w:ascii="Calibri" w:hAnsi="Calibri"/>
-          <w:b w:val="0"/>
-          <w:i w:val="0"/>
-          <w:sz w:val="22"/>
-        </w:rPr>
-        <w:t xml:space="preserve">Pretrial </w:t>
+        <w:t>He is a United States Marine Corps veteran and the author of</w:t>
       </w:r>
       <w:r>
         <w:rPr>
@@ -799,7 +777,7 @@
           <w:i/>
           <w:sz w:val="22"/>
         </w:rPr>
-        <w:t>and</w:t>
+        <w:t xml:space="preserve"> Surviving Pretrial </w:t>
       </w:r>
       <w:r>
         <w:rPr>
@@ -808,13 +786,17 @@
           <w:i w:val="0"/>
           <w:sz w:val="22"/>
         </w:rPr>
-        <w:t xml:space="preserve"> The 2255 Motion Handbook*, both available on Amazon under</w:t>
+        <w:t>and</w:t>
       </w:r>
-    </w:p>
-    <w:p>
-      <w:pPr>
-        <w:spacing w:after="160" w:before="0"/>
-      </w:pPr>
+      <w:r>
+        <w:rPr>
+          <w:rFonts w:ascii="Calibri" w:hAnsi="Calibri"/>
+          <w:b w:val="0"/>
+          <w:i/>
+          <w:sz w:val="22"/>
+        </w:rPr>
+        <w:t xml:space="preserve"> The 2255 Motion Handbook</w:t>
+      </w:r>
       <w:r>
         <w:rPr>
           <w:rFonts w:ascii="Calibri" w:hAnsi="Calibri"/>
@@ -822,21 +804,7 @@
           <w:i w:val="0"/>
           <w:sz w:val="22"/>
         </w:rPr>
-        <w:t>the Surviving the Feds Series. This column reflects personal experience</w:t>
-      </w:r>
-    </w:p>
-    <w:p>
-      <w:pPr>
-        <w:spacing w:after="160" w:before="0"/>
-      </w:pPr>
-      <w:r>
-        <w:rPr>
-          <w:rFonts w:ascii="Calibri" w:hAnsi="Calibri"/>
-          <w:b w:val="0"/>
-          <w:i w:val="0"/>
-          <w:sz w:val="22"/>
-        </w:rPr>
-        <w:t>and is not legal advice.*</w:t>
+        <w:t>, both available on Amazon under the Surviving the Feds Series. This column reflects personal experience and is not legal advice.*</w:t>
       </w:r>
     </w:p>
     <w:sectPr>

</xml_diff>